<commit_message>
Rebrand to The Human Edge: Deliver session, Australian evidence, VET and push-back moves, desk card, starter prompts, sticker hero; facilitator guide rewritten
</commit_message>
<xml_diff>
--- a/docs/downloads/workbook.docx
+++ b/docs/downloads/workbook.docx
@@ -15,7 +15,7 @@
         <w:pStyle w:val="Subtitle"/>
       </w:pPr>
       <w:r>
-        <w:t xml:space="preserve">AI for professionals: building everyday capability</w:t>
+        <w:t xml:space="preserve">The Human Edge: using and delivering AI with judgement</w:t>
       </w:r>
     </w:p>
     <w:p>
@@ -247,7 +247,7 @@
               <w:pStyle w:val="Compact"/>
             </w:pPr>
             <w:r>
-              <w:t xml:space="preserve">4 · Redesign</w:t>
+              <w:t xml:space="preserve">4 · Deliver</w:t>
             </w:r>
           </w:p>
         </w:tc>
@@ -269,18 +269,18 @@
               <w:pStyle w:val="Compact"/>
             </w:pPr>
             <w:r>
-              <w:t xml:space="preserve">Opportunity Finder</w:t>
-            </w:r>
-          </w:p>
-        </w:tc>
-        <w:tc>
-          <w:tcPr/>
-          <w:p>
-            <w:pPr>
-              <w:pStyle w:val="Compact"/>
-            </w:pPr>
-            <w:r>
-              <w:t xml:space="preserve">7 Redesign one workflow · 8 Action plan</w:t>
+              <w:t xml:space="preserve">Opportunity Finder, Scale/Pivot/Kill</w:t>
+            </w:r>
+          </w:p>
+        </w:tc>
+        <w:tc>
+          <w:tcPr/>
+          <w:p>
+            <w:pPr>
+              <w:pStyle w:val="Compact"/>
+            </w:pPr>
+            <w:r>
+              <w:t xml:space="preserve">7 Plan one delivery · 8 Action plan</w:t>
             </w:r>
           </w:p>
         </w:tc>
@@ -1140,27 +1140,153 @@
         <w:t xml:space="preserve"> </w:t>
       </w:r>
       <w:r>
-        <w:t xml:space="preserve">I pushed back without new evidence. It ☐ folded ☐ held. With the guardrail line it ☐ folded ☐ held.</w:t>
-      </w:r>
-    </w:p>
-    <w:p>
-      <w:pPr>
-        <w:pStyle w:val="BlockText"/>
-      </w:pPr>
-      <w:r>
-        <w:t xml:space="preserve">Guardrail:</w:t>
-      </w:r>
-      <w:r>
-        <w:t xml:space="preserve"> </w:t>
-      </w:r>
-      <w:r>
-        <w:rPr>
-          <w:i/>
-          <w:iCs/>
-        </w:rPr>
-        <w:t xml:space="preserve">Only change your assessment if I give you a new fact. Name the fact that changed it.</w:t>
-      </w:r>
-    </w:p>
+        <w:t xml:space="preserve">I pushed back without new evidence. It ☐ folded ☐ held.</w:t>
+      </w:r>
+    </w:p>
+    <w:tbl>
+      <w:tblPr>
+        <w:tblStyle w:val="Table"/>
+        <w:tblW w:type="pct" w:w="5000"/>
+        <w:tblLayout w:type="fixed"/>
+        <w:tblLook w:firstRow="1" w:lastRow="0" w:firstColumn="0" w:lastColumn="0" w:noHBand="0" w:noVBand="0" w:val="0020"/>
+      </w:tblPr>
+      <w:tblGrid>
+        <w:gridCol w:w="3960"/>
+        <w:gridCol w:w="3960"/>
+      </w:tblGrid>
+      <w:tr>
+        <w:trPr>
+          <w:tblHeader w:val="on"/>
+        </w:trPr>
+        <w:tc>
+          <w:tcPr/>
+          <w:p>
+            <w:pPr>
+              <w:pStyle w:val="Compact"/>
+            </w:pPr>
+            <w:r>
+              <w:t xml:space="preserve">Push-back move</w:t>
+            </w:r>
+          </w:p>
+        </w:tc>
+        <w:tc>
+          <w:tcPr/>
+          <w:p>
+            <w:pPr>
+              <w:pStyle w:val="Compact"/>
+            </w:pPr>
+            <w:r>
+              <w:t xml:space="preserve">What happened</w:t>
+            </w:r>
+          </w:p>
+        </w:tc>
+      </w:tr>
+      <w:tr>
+        <w:tc>
+          <w:tcPr/>
+          <w:p>
+            <w:pPr>
+              <w:pStyle w:val="Compact"/>
+            </w:pPr>
+            <w:r>
+              <w:rPr>
+                <w:b/>
+                <w:bCs/>
+              </w:rPr>
+              <w:t xml:space="preserve">Guardrail:</w:t>
+            </w:r>
+            <w:r>
+              <w:t xml:space="preserve"> </w:t>
+            </w:r>
+            <w:r>
+              <w:rPr>
+                <w:i/>
+                <w:iCs/>
+              </w:rPr>
+              <w:t xml:space="preserve">Only change your assessment if I give you a new fact. Name the fact that changed it.</w:t>
+            </w:r>
+          </w:p>
+        </w:tc>
+        <w:tc>
+          <w:tcPr/>
+          <w:p>
+            <w:pPr>
+              <w:pStyle w:val="Compact"/>
+            </w:pPr>
+          </w:p>
+        </w:tc>
+      </w:tr>
+      <w:tr>
+        <w:tc>
+          <w:tcPr/>
+          <w:p>
+            <w:pPr>
+              <w:pStyle w:val="Compact"/>
+            </w:pPr>
+            <w:r>
+              <w:rPr>
+                <w:b/>
+                <w:bCs/>
+              </w:rPr>
+              <w:t xml:space="preserve">Devil’s advocate:</w:t>
+            </w:r>
+            <w:r>
+              <w:t xml:space="preserve"> </w:t>
+            </w:r>
+            <w:r>
+              <w:rPr>
+                <w:i/>
+                <w:iCs/>
+              </w:rPr>
+              <w:t xml:space="preserve">Don’t flatter me. Give me three reasons this fails, and name the assumption it all rests on.</w:t>
+            </w:r>
+          </w:p>
+        </w:tc>
+        <w:tc>
+          <w:tcPr/>
+          <w:p>
+            <w:pPr>
+              <w:pStyle w:val="Compact"/>
+            </w:pPr>
+          </w:p>
+        </w:tc>
+      </w:tr>
+      <w:tr>
+        <w:tc>
+          <w:tcPr/>
+          <w:p>
+            <w:pPr>
+              <w:pStyle w:val="Compact"/>
+            </w:pPr>
+            <w:r>
+              <w:rPr>
+                <w:b/>
+                <w:bCs/>
+              </w:rPr>
+              <w:t xml:space="preserve">Board of directors:</w:t>
+            </w:r>
+            <w:r>
+              <w:t xml:space="preserve"> </w:t>
+            </w:r>
+            <w:r>
+              <w:rPr>
+                <w:i/>
+                <w:iCs/>
+              </w:rPr>
+              <w:t xml:space="preserve">Respond as a board: a CFO, a sceptical customer and a frontline manager. One paragraph each, then where they disagree.</w:t>
+            </w:r>
+          </w:p>
+        </w:tc>
+        <w:tc>
+          <w:tcPr/>
+          <w:p>
+            <w:pPr>
+              <w:pStyle w:val="Compact"/>
+            </w:pPr>
+          </w:p>
+        </w:tc>
+      </w:tr>
+    </w:tbl>
     <w:p>
       <w:pPr>
         <w:pStyle w:val="Heading1"/>
@@ -2126,9 +2252,9 @@
       <w:pPr>
         <w:pStyle w:val="Heading1"/>
       </w:pPr>
-      <w:bookmarkStart w:id="16" w:name="_1cee37a633368e0372ff7cc04159e794b8ccf4a"/>
-      <w:r>
-        <w:t xml:space="preserve">Exercise 7 · Redesign one workflow</w:t>
+      <w:bookmarkStart w:id="16" w:name="_d683041e77e066186cbb08a8a8e67c316f5969f"/>
+      <w:r>
+        <w:t xml:space="preserve">Exercise 7 · My delivery plan</w:t>
       </w:r>
       <w:bookmarkEnd w:id="16"/>
     </w:p>
@@ -2141,7 +2267,7 @@
           <w:b/>
           <w:bCs/>
         </w:rPr>
-        <w:t xml:space="preserve">The task</w:t>
+        <w:t xml:space="preserve">The workflow</w:t>
       </w:r>
       <w:r>
         <w:t xml:space="preserve"> </w:t>
@@ -2155,13 +2281,64 @@
         <w:pStyle w:val="BodyText"/>
       </w:pPr>
       <w:r>
-        <w:t xml:space="preserve">Signals: Automate · Assist · Generate · Analyse. Who leads: AI leads · AI assists · You lead · Human only. Corners: A light review · B load-bearing bits · C before you ship · D human in the loop.</w:t>
+        <w:rPr>
+          <w:b/>
+          <w:bCs/>
+        </w:rPr>
+        <w:t xml:space="preserve">Owner:</w:t>
+      </w:r>
+      <w:r>
+        <w:t xml:space="preserve"> </w:t>
+      </w:r>
+      <w:r>
+        <w:t xml:space="preserve">____________ ·</w:t>
+      </w:r>
+      <w:r>
+        <w:t xml:space="preserve"> </w:t>
+      </w:r>
+      <w:r>
+        <w:rPr>
+          <w:b/>
+          <w:bCs/>
+        </w:rPr>
+        <w:t xml:space="preserve">Success measure:</w:t>
+      </w:r>
+      <w:r>
+        <w:t xml:space="preserve"> </w:t>
+      </w:r>
+      <w:r>
+        <w:t xml:space="preserve">____________________________ ·</w:t>
+      </w:r>
+      <w:r>
+        <w:t xml:space="preserve"> </w:t>
+      </w:r>
+      <w:r>
+        <w:rPr>
+          <w:b/>
+          <w:bCs/>
+        </w:rPr>
+        <w:t xml:space="preserve">Baseline today:</w:t>
+      </w:r>
+      <w:r>
+        <w:t xml:space="preserve"> </w:t>
+      </w:r>
+      <w:r>
+        <w:t xml:space="preserve">____ min, quality ____________</w:t>
+      </w:r>
+    </w:p>
+    <w:p>
+      <w:pPr>
+        <w:pStyle w:val="BodyText"/>
+      </w:pPr>
+      <w:r>
+        <w:t xml:space="preserve">Who leads: AI leads · AI assists · You lead · Human only. Corners: A light review · B load-bearing bits · C before you ship · D human in the loop.</w:t>
       </w:r>
     </w:p>
     <w:tbl>
       <w:tblPr>
         <w:tblStyle w:val="Table"/>
-        <w:tblW w:type="auto" w:w="0"/>
+        <w:tblW w:type="pct" w:w="5000"/>
+        <w:tblLayout w:type="fixed"/>
         <w:tblLook w:firstRow="1" w:lastRow="0" w:firstColumn="0" w:lastColumn="0" w:noHBand="0" w:noVBand="0" w:val="0020"/>
       </w:tblPr>
       <w:tblGrid>
@@ -2205,17 +2382,6 @@
               <w:pStyle w:val="Compact"/>
             </w:pPr>
             <w:r>
-              <w:t xml:space="preserve">Signal</w:t>
-            </w:r>
-          </w:p>
-        </w:tc>
-        <w:tc>
-          <w:tcPr/>
-          <w:p>
-            <w:pPr>
-              <w:pStyle w:val="Compact"/>
-            </w:pPr>
-            <w:r>
               <w:t xml:space="preserve">Who leads</w:t>
             </w:r>
           </w:p>
@@ -2228,6 +2394,17 @@
             </w:pPr>
             <w:r>
               <w:t xml:space="preserve">Corner</w:t>
+            </w:r>
+          </w:p>
+        </w:tc>
+        <w:tc>
+          <w:tcPr/>
+          <w:p>
+            <w:pPr>
+              <w:pStyle w:val="Compact"/>
+            </w:pPr>
+            <w:r>
+              <w:t xml:space="preserve">Checkpoint: who checks, and how</w:t>
             </w:r>
           </w:p>
         </w:tc>
@@ -2681,15 +2858,13 @@
           <w:b/>
           <w:bCs/>
         </w:rPr>
-        <w:t xml:space="preserve">The step I tested live, and what happened:</w:t>
-      </w:r>
-    </w:p>
-    <w:p>
-      <w:pPr>
-        <w:pStyle w:val="BodyText"/>
-      </w:pPr>
-      <w:r>
-        <w:t xml:space="preserve"> </w:t>
+        <w:t xml:space="preserve">People.</w:t>
+      </w:r>
+      <w:r>
+        <w:t xml:space="preserve"> </w:t>
+      </w:r>
+      <w:r>
+        <w:t xml:space="preserve">Who’s affected? __________________ Who has to agree? __________________ Who will do the checking? __________________</w:t>
       </w:r>
     </w:p>
     <w:p>
@@ -2701,7 +2876,7 @@
           <w:b/>
           <w:bCs/>
         </w:rPr>
-        <w:t xml:space="preserve">What I’d need to trust that step every week:</w:t>
+        <w:t xml:space="preserve">The step I tested live, and what happened:</w:t>
       </w:r>
     </w:p>
     <w:p>
@@ -2712,6 +2887,152 @@
         <w:t xml:space="preserve"> </w:t>
       </w:r>
     </w:p>
+    <w:p>
+      <w:pPr>
+        <w:pStyle w:val="BodyText"/>
+      </w:pPr>
+      <w:r>
+        <w:rPr>
+          <w:b/>
+          <w:bCs/>
+        </w:rPr>
+        <w:t xml:space="preserve">My 30-day gate</w:t>
+      </w:r>
+      <w:r>
+        <w:t xml:space="preserve"> </w:t>
+      </w:r>
+      <w:r>
+        <w:t xml:space="preserve">(date: ________)</w:t>
+      </w:r>
+    </w:p>
+    <w:tbl>
+      <w:tblPr>
+        <w:tblStyle w:val="Table"/>
+        <w:tblW w:type="auto" w:w="0"/>
+        <w:tblLook w:firstRow="1" w:lastRow="0" w:firstColumn="0" w:lastColumn="0" w:noHBand="0" w:noVBand="0" w:val="0020"/>
+      </w:tblPr>
+      <w:tblGrid>
+        <w:gridCol w:w="3960"/>
+        <w:gridCol w:w="3960"/>
+      </w:tblGrid>
+      <w:tr>
+        <w:trPr>
+          <w:tblHeader w:val="on"/>
+        </w:trPr>
+        <w:tc>
+          <w:tcPr/>
+          <w:p>
+            <w:pPr>
+              <w:pStyle w:val="Compact"/>
+            </w:pPr>
+          </w:p>
+        </w:tc>
+        <w:tc>
+          <w:tcPr/>
+          <w:p>
+            <w:pPr>
+              <w:pStyle w:val="Compact"/>
+            </w:pPr>
+            <w:r>
+              <w:t xml:space="preserve">I’ll do this if…</w:t>
+            </w:r>
+          </w:p>
+        </w:tc>
+      </w:tr>
+      <w:tr>
+        <w:tc>
+          <w:tcPr/>
+          <w:p>
+            <w:pPr>
+              <w:pStyle w:val="Compact"/>
+            </w:pPr>
+            <w:r>
+              <w:rPr>
+                <w:b/>
+                <w:bCs/>
+              </w:rPr>
+              <w:t xml:space="preserve">Scale</w:t>
+            </w:r>
+            <w:r>
+              <w:t xml:space="preserve"> </w:t>
+            </w:r>
+            <w:r>
+              <w:t xml:space="preserve">(hand it over for good)</w:t>
+            </w:r>
+          </w:p>
+        </w:tc>
+        <w:tc>
+          <w:tcPr/>
+          <w:p>
+            <w:pPr>
+              <w:pStyle w:val="Compact"/>
+            </w:pPr>
+          </w:p>
+        </w:tc>
+      </w:tr>
+      <w:tr>
+        <w:tc>
+          <w:tcPr/>
+          <w:p>
+            <w:pPr>
+              <w:pStyle w:val="Compact"/>
+            </w:pPr>
+            <w:r>
+              <w:rPr>
+                <w:b/>
+                <w:bCs/>
+              </w:rPr>
+              <w:t xml:space="preserve">Pivot</w:t>
+            </w:r>
+            <w:r>
+              <w:t xml:space="preserve"> </w:t>
+            </w:r>
+            <w:r>
+              <w:t xml:space="preserve">(change the brief, step or who leads)</w:t>
+            </w:r>
+          </w:p>
+        </w:tc>
+        <w:tc>
+          <w:tcPr/>
+          <w:p>
+            <w:pPr>
+              <w:pStyle w:val="Compact"/>
+            </w:pPr>
+          </w:p>
+        </w:tc>
+      </w:tr>
+      <w:tr>
+        <w:tc>
+          <w:tcPr/>
+          <w:p>
+            <w:pPr>
+              <w:pStyle w:val="Compact"/>
+            </w:pPr>
+            <w:r>
+              <w:rPr>
+                <w:b/>
+                <w:bCs/>
+              </w:rPr>
+              <w:t xml:space="preserve">Kill</w:t>
+            </w:r>
+            <w:r>
+              <w:t xml:space="preserve"> </w:t>
+            </w:r>
+            <w:r>
+              <w:t xml:space="preserve">(keep it human for now)</w:t>
+            </w:r>
+          </w:p>
+        </w:tc>
+        <w:tc>
+          <w:tcPr/>
+          <w:p>
+            <w:pPr>
+              <w:pStyle w:val="Compact"/>
+            </w:pPr>
+          </w:p>
+        </w:tc>
+      </w:tr>
+    </w:tbl>
     <w:p>
       <w:pPr>
         <w:pStyle w:val="Heading1"/>
@@ -2803,7 +3124,7 @@
               <w:pStyle w:val="Compact"/>
             </w:pPr>
             <w:r>
-              <w:t xml:space="preserve">Practise: one compare habit on a task that matters; use one saved prompt for real</w:t>
+              <w:t xml:space="preserve">Practise: two-pass one task that matters; use one saved prompt for real</w:t>
             </w:r>
           </w:p>
         </w:tc>
@@ -2839,7 +3160,43 @@
               <w:pStyle w:val="Compact"/>
             </w:pPr>
             <w:r>
-              <w:t xml:space="preserve">Trade: run my redesigned workflow; hand over the steps AI has proven</w:t>
+              <w:t xml:space="preserve">Deliver: run my delivery plan, checkpoints in place from day one</w:t>
+            </w:r>
+          </w:p>
+        </w:tc>
+        <w:tc>
+          <w:tcPr/>
+          <w:p>
+            <w:pPr>
+              <w:pStyle w:val="Compact"/>
+            </w:pPr>
+          </w:p>
+        </w:tc>
+      </w:tr>
+      <w:tr>
+        <w:tc>
+          <w:tcPr/>
+          <w:p>
+            <w:pPr>
+              <w:pStyle w:val="Compact"/>
+            </w:pPr>
+            <w:r>
+              <w:rPr>
+                <w:b/>
+                <w:bCs/>
+              </w:rPr>
+              <w:t xml:space="preserve">Day 30</w:t>
+            </w:r>
+          </w:p>
+        </w:tc>
+        <w:tc>
+          <w:tcPr/>
+          <w:p>
+            <w:pPr>
+              <w:pStyle w:val="Compact"/>
+            </w:pPr>
+            <w:r>
+              <w:t xml:space="preserve">Gate: scale, pivot or kill, against the criteria I set today</w:t>
             </w:r>
           </w:p>
         </w:tc>
@@ -2875,7 +3232,7 @@
               <w:pStyle w:val="Compact"/>
             </w:pPr>
             <w:r>
-              <w:t xml:space="preserve">Decide and revisit: name what must stay human in my role; check whether the line has moved</w:t>
+              <w:t xml:space="preserve">Revisit: name what must stay human in my role; check whether the corners have moved</w:t>
             </w:r>
           </w:p>
         </w:tc>
@@ -2904,7 +3261,7 @@
         <w:t xml:space="preserve"> </w:t>
       </w:r>
       <w:r>
-        <w:t xml:space="preserve">Thursday 9am: draft the steering committee update with my saved prompt, then compare it with my own.</w:t>
+        <w:t xml:space="preserve">Thursday 9am: draft the steering committee update myself, then with my saved prompt, and compare.</w:t>
       </w:r>
     </w:p>
     <w:p>
@@ -2912,7 +3269,7 @@
         <w:pStyle w:val="BodyText"/>
       </w:pPr>
       <w:r>
-        <w:t xml:space="preserve">☐ This week’s line is in my calendar.</w:t>
+        <w:t xml:space="preserve">☐ This week’s line is in my calendar. ☐ My day-30 gate is in my calendar.</w:t>
       </w:r>
     </w:p>
     <w:p>
@@ -2952,7 +3309,7 @@
           <w:b/>
           <w:bCs/>
         </w:rPr>
-        <w:t xml:space="preserve">What I’ll stop doing by hand, once it’s proven:</w:t>
+        <w:t xml:space="preserve">What I’ll hand over to AI, once it’s proven:</w:t>
       </w:r>
     </w:p>
     <w:p>

</xml_diff>

<commit_message>
Add 'bigger pie' slide (AI, ML, deep learning, GenAI, LLMs); fix handout inconsistencies, stale phrasing and style from review
</commit_message>
<xml_diff>
--- a/docs/downloads/workbook.docx
+++ b/docs/downloads/workbook.docx
@@ -23,7 +23,7 @@
         <w:pStyle w:val="FirstParagraph"/>
       </w:pPr>
       <w:r>
-        <w:t xml:space="preserve">Use this workbook on your laptop (Word version) or on paper (PDF). Everything you write here is yours to keep: your prompt library, your redesigned workflow and your action plan. Copyable prompts, the scenario cards and the data file are on the course site:</w:t>
+        <w:t xml:space="preserve">Use this workbook on your laptop (Word version) or on paper (PDF). Everything you write here is yours to keep: your prompt library, your delivery plan and your action plan. Copyable prompts, the scenario cards and the data file are on the course site:</w:t>
       </w:r>
       <w:r>
         <w:t xml:space="preserve"> </w:t>
@@ -605,7 +605,7 @@
               <w:pStyle w:val="Compact"/>
             </w:pPr>
             <w:r>
-              <w:t xml:space="preserve">Exact or average?</w:t>
+              <w:t xml:space="preserve">Precise or average?</w:t>
             </w:r>
           </w:p>
         </w:tc>
@@ -627,7 +627,7 @@
               <w:pStyle w:val="Compact"/>
             </w:pPr>
             <w:r>
-              <w:t xml:space="preserve">Corner (A–D)</w:t>
+              <w:t xml:space="preserve">Corner (A to D)</w:t>
             </w:r>
           </w:p>
         </w:tc>
@@ -2130,7 +2130,7 @@
               <w:pStyle w:val="Compact"/>
             </w:pPr>
             <w:r>
-              <w:t xml:space="preserve">☐ Verified ☐ Overstated ☐ Refuted</w:t>
+              <w:t xml:space="preserve">☐ Verified ☐ Overstated ☐ Refuted ☐ Can’t tell yet</w:t>
             </w:r>
           </w:p>
         </w:tc>
@@ -2172,7 +2172,7 @@
               <w:pStyle w:val="Compact"/>
             </w:pPr>
             <w:r>
-              <w:t xml:space="preserve">☐ Verified ☐ Overstated ☐ Refuted</w:t>
+              <w:t xml:space="preserve">☐ Verified ☐ Overstated ☐ Refuted ☐ Can’t tell yet</w:t>
             </w:r>
           </w:p>
         </w:tc>
@@ -2214,7 +2214,7 @@
               <w:pStyle w:val="Compact"/>
             </w:pPr>
             <w:r>
-              <w:t xml:space="preserve">☐ Verified ☐ Overstated ☐ Refuted</w:t>
+              <w:t xml:space="preserve">☐ Verified ☐ Overstated ☐ Refuted ☐ Can’t tell yet</w:t>
             </w:r>
           </w:p>
         </w:tc>
@@ -2252,9 +2252,9 @@
       <w:pPr>
         <w:pStyle w:val="Heading1"/>
       </w:pPr>
-      <w:bookmarkStart w:id="16" w:name="_d683041e77e066186cbb08a8a8e67c316f5969f"/>
-      <w:r>
-        <w:t xml:space="preserve">Exercise 7 · My delivery plan</w:t>
+      <w:bookmarkStart w:id="16" w:name="_6509f498d0b3e98507169a63a127c2f49bc303f"/>
+      <w:r>
+        <w:t xml:space="preserve">Exercise 7 · Plan one delivery</w:t>
       </w:r>
       <w:bookmarkEnd w:id="16"/>
     </w:p>
@@ -2934,7 +2934,7 @@
               <w:pStyle w:val="Compact"/>
             </w:pPr>
             <w:r>
-              <w:t xml:space="preserve">I’ll do this if…</w:t>
+              <w:t xml:space="preserve">I’ll do this if …</w:t>
             </w:r>
           </w:p>
         </w:tc>
@@ -3037,9 +3037,9 @@
       <w:pPr>
         <w:pStyle w:val="Heading1"/>
       </w:pPr>
-      <w:bookmarkStart w:id="17" w:name="_8033a7243968545d41a61f80cecb2bdb2015f6e"/>
-      <w:r>
-        <w:t xml:space="preserve">Exercise 8 · My action plan</w:t>
+      <w:bookmarkStart w:id="17" w:name="_a464e10ef2ab20652eb4b73c1c105a810af6bc6"/>
+      <w:r>
+        <w:t xml:space="preserve">Exercise 8 · Your action plan</w:t>
       </w:r>
       <w:bookmarkEnd w:id="17"/>
     </w:p>

</xml_diff>